<commit_message>
İkinci başlıktaki dört ilke paragrafını kaynaklı olarak yeniden yaz
Tek paragrafta toplanan dört ilke ve biyomimikri karşılaştırması iki
paragrafa ayrıldı. Yazar adları paragraf içinde açıkça verildi, vernaküler
mimarlık saptamasına parantezli atıf eklendi ve biyomimikri karşılaştırması
Kırbaş Akyürek ve diğ. (2020) kaynağına dayandırıldı. Taklit ile ilke
çıkarma arasındaki ayrım, aktarılanın çözüm mü yoksa çözümü üreten mantık
mı olduğu üzerinden açıldı.

Co-Authored-By: Claude Opus 5 <noreply@anthropic.com>
Claude-Session: https://claude.ai/code/session_01A7bv5SYpnVudfqWACh8kXV
</commit_message>
<xml_diff>
--- a/Kitap_Bolumu_Biyotasarim_Malzeme_Secimi.docx
+++ b/Kitap_Bolumu_Biyotasarim_Malzeme_Secimi.docx
@@ -1204,7 +1204,21 @@
           <w:sz w:val="24"/>
           <w:szCs w:val="24"/>
         </w:rPr>
-        <w:t xml:space="preserve">Yazarlar bu modelden dört ilke türetmektedir: çeşitlilik; biçimin karmaşıklığı ve özgüllüğü; dirençlilik yoluyla dayanıklılık; geri besleme ve uyarlanma. İlkelerin kendi başlarına yeni olmadığını, modern inşaat sanayisinin doğuşundan önce mimarlığın uzun süre bu stratejilerle üretildiğini ve vernaküler mimarlığın bu stratejileri büyük ölçüde içerdiğini de belirtmektedirler. Üçüncü ilke, beşinci başlıkta ayrıntılandırılacağı üzere, biyomalzemelerle çalışmanın kuramsal gerekçesini oluşturmaktadır. Bu çerçeve, biyotasarımı biyomimikriden ayıran asıl noktayı da görünür kılmaktadır: ilişki bir taklit ilişkisi değil, bir ilke çıkarma ilişkisidir. Doğanın biçimleri kopyalanmaz; doğanın biçim üretme mantığı incelenerek tasarım süreci yeniden kurgulanır.</w:t>
+        <w:t xml:space="preserve">Andréen ve Goidea (2022), biyolojik tasarımı bir model olarak alarak dört tasarım ilkesi türetmektedir. Birincisi çeşitlilik, ikincisi biçimin karmaşıklığı ve özgüllüğü, üçüncüsü dirençlilik yoluyla dayanıklılık, dördüncüsü geri besleme ve uyarlanmadır. Yazarlar bu ilkelerin kendi başlarına yeni olmadığını özellikle vurgulamaktadır: modern inşaat sanayisinin doğuşundan önce mimarlık uzun süre bu stratejilerle üretilmiş; hem tarihsel hem güncel vernaküler mimarlık bu stratejileri büyük ölçüde içermiştir (Andréen ve Goidea, 2022). İlkelerden üçüncüsü, beşinci başlıkta ayrıntılandırılacağı üzere, biyomalzemelerle çalışmanın kuramsal gerekçesini oluşturmaktadır.</w:t>
+      </w:r>
+    </w:p>
+    <w:p>
+      <w:pPr>
+        <w:spacing w:after="160" w:line="360"/>
+        <w:jc w:val="both"/>
+      </w:pPr>
+      <w:r>
+        <w:rPr>
+          <w:rFonts w:ascii="Times New Roman" w:cs="Times New Roman" w:eastAsia="Times New Roman" w:hAnsi="Times New Roman"/>
+          <w:sz w:val="24"/>
+          <w:szCs w:val="24"/>
+        </w:rPr>
+        <w:t xml:space="preserve">Dört ilke bir arada okunduğunda, biyotasarımı biyomimikriden ayıran nokta da görünür hâle gelmektedir. Kırbaş Akyürek ve diğ.’nin (2020) belirttiği gibi biyomimikrinin temel amacı biyolojik süreçleri teknolojilere çevirmektir; bu yaklaşımda aktarılan şey, doğanın geliştirdiği çözümün kendisidir. Andréen ve Goidea’nın (2022) ilkelerinde ise aktarılan şey çözüm değil, çözümü üreten mantıktır: doğanın biçimleri kopyalanmaz, doğanın biçim üretme biçimi incelenerek tasarım süreci yeniden kurgulanır. İlişki bu nedenle bir taklit değil, bir ilke çıkarma ilişkisidir; bu ayrım, izleyen başlıkta malzemelerin sınıflandırılmasında da belirleyici olacaktır.</w:t>
       </w:r>
     </w:p>
     <w:p>

</xml_diff>

<commit_message>
5.2'yi numaralı sıralamadan akıcı anlatıma çevir
Dört paragraf iki paragrafa indirildi; "birinci/ikinci/üçüncü/dördüncü
değişiklik" sıralaması kaldırılıp kavramlar birbirine bağlanarak
aktarıldı. Dört kavram (malzeme potansiyeli, parametre olarak
değişkenlik, malzemenin zamanı, tasarım kararı olarak bakım) korundu ve
son cümlede toparlandı. Alt başlık 480 kelimeden 316 kelimeye indi;
Andréen ve Goidea (2022) anışı bu alt başlıktan çıkarıldı.

Co-Authored-By: Claude Opus 5 <noreply@anthropic.com>
Claude-Session: https://claude.ai/code/session_01A7bv5SYpnVudfqWACh8kXV
</commit_message>
<xml_diff>
--- a/Kitap_Bolumu_Biyotasarim_Malzeme_Secimi.docx
+++ b/Kitap_Bolumu_Biyotasarim_Malzeme_Secimi.docx
@@ -2497,7 +2497,7 @@
           <w:sz w:val="24"/>
           <w:szCs w:val="24"/>
         </w:rPr>
-        <w:t xml:space="preserve">Önceki alt başlıkta dirençliliğin iki tanımı ayırt edilmişti. Burada sorulan soru farklıdır: biyotasarım ve biyolojik temelli malzemeler tasarım sürecine girdiğinde bu süreçte ne değişir ve hangi yeni kavramlar ortaya çıkar? Birinci değişiklik, tasarımcının malzeme geliştirmedeki konumuyla ilgilidir. Barati ve Karana (2019), tasarımcılar ile malzeme bilimcileri arasındaki erken aşama ortak projelerinde tasarımcıların yaratıcı katkısını inceledikleri çalışmalarında, yaratıcılığı tasarımcının zihnine ait bir yeti olarak gören bakıştan uzaklaşmayı; onu tasarımcı ile maddi dünya arasında dağılmış bir süreç olarak ele almayı önermektedir. Yazarların geliştirdiği malzeme potansiyeli olarak olanaklar kavramı, odağı tasarımcının yapma ve üretme edimlerine kaydırmakta; bu edimler hem yerleşik hem yeni malzemelerde daha önce görülmemiş olanakların açığa çıkarılması olarak tanımlanmaktadır. Biyolojik temelli malzemelerde tasarımcının işi böylece bir listeden seçim yapmak değil, malzemenin neye olanak tanıdığını üretim yoluyla keşfetmek hâline gelir.</w:t>
+        <w:t xml:space="preserve">Önceki alt başlıkta dirençliliğin iki tanımı ayırt edilmişti; burada sorulan soru farklıdır: biyolojik temelli malzemeler tasarım sürecine girdiğinde bu süreçte ne değişir? Değişimin ilk durağı tasarımcının konumudur. Barati ve Karana (2019), tasarımcılar ile malzeme bilimcileri arasındaki erken aşama ortak projelerini inceledikleri çalışmalarında yaratıcılığın tasarımcının zihnine ait bir yeti olmadığını, tasarımcı ile maddi dünya arasında dağılmış bir süreç olduğunu ileri sürmekte; geliştirdikleri malzeme potansiyeli olarak olanaklar kavramıyla odağı tasarımcının yapma ve üretme edimlerine kaydırmaktadır. Bu edimler, hem yerleşik hem yeni malzemelerde daha önce görülmemiş olanakların açığa çıkarılmasıdır. Tasarımcının işi böylece bir listeden seçim yapmak değil, malzemenin neye olanak tanıdığını üretim yoluyla keşfetmek hâline gelir; keşfedilen şey ise çoğu zaman malzemenin değişkenliğidir. Goidea ve diğ. (2022), miselyum biyokompozitlerde farklı mantar türlerinin hem üretim süreci hem de nesnenin performansı bakımından farklı sonuçlara yol açtığını; tür seçiminde büyüme hızı ve genetik kararlılığın yanı sıra dayanım, ısı iletkenliği ve görünüm gibi etkenlerin devreye girdiğini belirtmektedir. Değişkenlik bu çerçevede bir kusur değil, tasarımcının üzerinde çalıştığı parametre kümesidir; mimar biçim çizmek yerine, ancak bir bağlama yerleştirildiğinde anlam kazanan süreçleri tanımlar.</w:t>
       </w:r>
     </w:p>
     <w:p>
@@ -2511,35 +2511,7 @@
           <w:sz w:val="24"/>
           <w:szCs w:val="24"/>
         </w:rPr>
-        <w:t xml:space="preserve">İkinci değişiklik, değişkenliğin tasarım girdisine dönüşmesidir. Goidea ve diğ. (2022), biyofabrikasyonun en umut verici yönlerinden birinin adaptasyon ve değişkenlik potansiyeli olduğunu belirtmektedir. Yazarlara göre miselyum biyokompozitlerde farklı mantar türleri hem üretim süreci hem de mimari nesnenin performansı bakımından farklı sonuçlara yol açar; tür seçiminde büyüme hızı ve genetik kararlılığın yanı sıra dayanım, ısı iletkenliği ve görünüm gibi etkenler devreye girer. Değişkenlik bu çerçevede bir kusur değil, tasarımcının üzerinde çalıştığı parametre kümesidir: mimarlar biçim çizmek yerine, ancak bir bağlama yerleştirildiğinde anlam kazanan süreçleri tanımlayabilir. İkinci başlıkta anılan dirençlilik yoluyla dayanıklılık ilkesi de burada karşılığını bulur; Andréen ve Goidea (2022), biyomalzemelerin mühendislik ürünü malzemelere kıyasla daha az dayanıklılık sergiliyorlarsa aynı zamanda daha esnek, daha dinamik ve daha geri dönüştürülebilir olduklarını belirtmektedir.</w:t>
-      </w:r>
-    </w:p>
-    <w:p>
-      <w:pPr>
-        <w:spacing w:after="160" w:line="360"/>
-        <w:jc w:val="both"/>
-      </w:pPr>
-      <w:r>
-        <w:rPr>
-          <w:rFonts w:ascii="Times New Roman" w:cs="Times New Roman" w:eastAsia="Times New Roman" w:hAnsi="Times New Roman"/>
-          <w:sz w:val="24"/>
-          <w:szCs w:val="24"/>
-        </w:rPr>
-        <w:t xml:space="preserve">Üçüncü değişiklik zamana ilişkindir. Karana ve diğ. (2018), miselyum esaslı bir malzemeyle yürütülen tasarım sürecinde tasarımcının üç belirsizlik kaynağıyla baş etmek durumunda kaldığını ortaya koymaktadır: mikroorganizmanın failliği, malzemenin kendine özgü zamansallığı ve malzemenin toplum tarafından kabulü. Bunlardan ikincisi, malzemenin tasarımcının takviminden bağımsız bir zamanı olduğu anlamına gelir; büyüme, kuruma ve yaşlanma süreleri tasarım kararının dışında değil, içindedir. Ancak bu zamanın nasıl işlediği henüz büyük ölçüde bilinmemektedir: Chang ve diğ. (2020), biyokompozitlerin uzun süreli dayanıklılık performansına ilişkin bilimsel bilginin erişilebilir literatürde oldukça sınırlı kaldığını ortaya koymaktadır.</w:t>
-      </w:r>
-    </w:p>
-    <w:p>
-      <w:pPr>
-        <w:spacing w:after="160" w:line="360"/>
-        <w:jc w:val="both"/>
-      </w:pPr>
-      <w:r>
-        <w:rPr>
-          <w:rFonts w:ascii="Times New Roman" w:cs="Times New Roman" w:eastAsia="Times New Roman" w:hAnsi="Times New Roman"/>
-          <w:sz w:val="24"/>
-          <w:szCs w:val="24"/>
-        </w:rPr>
-        <w:t xml:space="preserve">Dördüncü değişiklik, bakımın bir tasarım kararına dönüşmesidir. Graham ve Thrift (2007), teknik nesne ve sistemlerde bozulma ve işlev kaybına odaklanmanın onarım ve bakım pratiklerinin hayatî katkısını görünür kıldığını; buna karşılık modern toplumları ayakta tutan altyapıya ilişkin yerleşik kültürel kurgu ve tahayyüllerin onarım ve bakım etkinliklerini dikkat alanının dışına ittiğini ileri sürmektedir. Biyolojik temelli malzemelerde bu dışarıda bırakma sürdürülemez; bakım, kullanımın kesintiye uğraması değil koşuludur. Dolayısıyla biyotasarımın tasarım sürecine kattığı dört kavram şöyle özetlenebilir: malzeme potansiyeli, parametre olarak değişkenlik, malzemenin kendi zamanı ve tasarım kararı olarak bakım.</w:t>
+        <w:t xml:space="preserve">Değişkenliğin ikiz kavramı zamandır. Karana ve diğ. (2018), miselyum esaslı bir malzemeyle yürütülen tasarım sürecinde tasarımcının mikroorganizmanın failliği, malzemenin kendine özgü zamansallığı ve malzemenin toplum tarafından kabulü biçiminde üç belirsizlik kaynağıyla baş etmek durumunda kaldığını ortaya koymaktadır. Bunlardan ikincisi, büyüme, kuruma ve yaşlanma sürelerinin tasarım kararının dışında değil içinde olduğu anlamına gelir; ne var ki bu zamanın nasıl işlediği henüz büyük ölçüde bilinmemektedir (Chang ve diğ., 2020). Zamanı tasarıma dahil etmenin doğrudan sonucu, bakımın bir tasarım kararına dönüşmesidir. Graham ve Thrift (2007), modern toplumları ayakta tutan altyapıya ilişkin yerleşik kültürel kurguların onarım ve bakım etkinliklerini dikkat alanının dışına ittiğini ileri sürmektedir; biyolojik temelli malzemelerde bu dışarıda bırakma sürdürülemez, çünkü bakım kullanımın kesintiye uğraması değil koşuludur. Böylece biyotasarımın tasarım sürecine kattığı kavram kümesi belirginleşir: keşfedilecek bir malzeme potansiyeli, parametreye dönüşen bir değişkenlik, hesaba katılması gereken bir malzeme zamanı ve baştan kurgulanan bir bakım ilişkisi.</w:t>
       </w:r>
     </w:p>
     <w:p>

</xml_diff>

<commit_message>
Beşinci bölümün son iki alt başlığını tek alt başlıkta birleştir
5.2 ve 5.3 "5.2. Biyomalzemeden dirençli mekâna" başlığı altında
toplandı; 758 kelime 442 kelimeye indirildi. Beşinci bölüm artık iki alt
başlık taşıyor. Biyotasarımın tasarım sürecine kattığı dört kavram ilk
paragrafta, dirençli iç mekânın dört tasarım özelliği ikinci paragrafta,
ölçekler arası okuma ve yedinci bölüme köprü üçüncü paragrafta toplandı.

Co-Authored-By: Claude Opus 5 <noreply@anthropic.com>
Claude-Session: https://claude.ai/code/session_01A7bv5SYpnVudfqWACh8kXV
</commit_message>
<xml_diff>
--- a/Kitap_Bolumu_Biyotasarim_Malzeme_Secimi.docx
+++ b/Kitap_Bolumu_Biyotasarim_Malzeme_Secimi.docx
@@ -2483,7 +2483,7 @@
           <w:sz w:val="24"/>
           <w:szCs w:val="24"/>
         </w:rPr>
-        <w:t xml:space="preserve">5.2. Biyomalzemenin tasarım sürecine kattıkları</w:t>
+        <w:t xml:space="preserve">5.2. Biyomalzemeden dirençli mekâna</w:t>
       </w:r>
     </w:p>
     <w:p>
@@ -2497,7 +2497,7 @@
           <w:sz w:val="24"/>
           <w:szCs w:val="24"/>
         </w:rPr>
-        <w:t xml:space="preserve">Önceki alt başlıkta dirençliliğin iki tanımı ayırt edilmişti; burada sorulan soru farklıdır: biyolojik temelli malzemeler tasarım sürecine girdiğinde bu süreçte ne değişir? Değişimin ilk durağı tasarımcının konumudur. Barati ve Karana (2019), tasarımcılar ile malzeme bilimcileri arasındaki erken aşama ortak projelerini inceledikleri çalışmalarında yaratıcılığın tasarımcının zihnine ait bir yeti olmadığını, tasarımcı ile maddi dünya arasında dağılmış bir süreç olduğunu ileri sürmekte; geliştirdikleri malzeme potansiyeli olarak olanaklar kavramıyla odağı tasarımcının yapma ve üretme edimlerine kaydırmaktadır. Bu edimler, hem yerleşik hem yeni malzemelerde daha önce görülmemiş olanakların açığa çıkarılmasıdır. Tasarımcının işi böylece bir listeden seçim yapmak değil, malzemenin neye olanak tanıdığını üretim yoluyla keşfetmek hâline gelir; keşfedilen şey ise çoğu zaman malzemenin değişkenliğidir. Goidea ve diğ. (2022), miselyum biyokompozitlerde farklı mantar türlerinin hem üretim süreci hem de nesnenin performansı bakımından farklı sonuçlara yol açtığını; tür seçiminde büyüme hızı ve genetik kararlılığın yanı sıra dayanım, ısı iletkenliği ve görünüm gibi etkenlerin devreye girdiğini belirtmektedir. Değişkenlik bu çerçevede bir kusur değil, tasarımcının üzerinde çalıştığı parametre kümesidir; mimar biçim çizmek yerine, ancak bir bağlama yerleştirildiğinde anlam kazanan süreçleri tanımlar.</w:t>
+        <w:t xml:space="preserve">Dirençliliğin ne anlama geldiği belirlendikten sonra sorulması gereken soru şudur: biyolojik temelli malzemeler tasarım sürecine girdiğinde bu süreçte ne değişir? Değişimin ilk durağı tasarımcının konumudur. Barati ve Karana (2019), tasarımcı ile malzeme bilimcisi arasındaki erken aşama ortak projelerini inceledikleri çalışmalarında yaratıcılığın tasarımcının zihnine ait bir yeti olmadığını, tasarımcı ile maddi dünya arasında dağılmış bir süreç olduğunu ileri sürmekte; geliştirdikleri malzeme potansiyeli olarak olanaklar kavramıyla odağı tasarımcının yapma ve üretme edimlerine kaydırmaktadır. Tasarımcının işi böylece bir listeden seçim yapmak değil, malzemenin neye olanak tanıdığını üretim yoluyla keşfetmek hâline gelir; keşfedilen şey ise çoğu zaman değişkenliktir. Goidea ve diğ. (2022), miselyum biyokompozitlerde tür seçiminin hem üretim sürecini hem nesnenin performansını değiştirdiğini göstermektedir; değişkenlik burada bir kusur değil, tasarımcının üzerinde çalıştığı parametre kümesidir. Değişkenliğin ikizi ise zamandır: Karana ve diğ. (2018), malzemenin kendine özgü zamansallığını tasarımcının baş etmek zorunda olduğu üç belirsizlikten biri olarak saymakta; Chang ve diğ. (2020) bu zamanın nasıl işlediğine ilişkin bilginin oldukça sınırlı kaldığını ortaya koymaktadır. Zamanın tasarıma girmesinin doğrudan sonucu, bakımın bir tasarım kararına dönüşmesidir; Graham ve Thrift (2007), yerleşik kültürel kurguların onarım ve bakımı dikkat alanının dışına ittiğini belirtmektedir, oysa biyolojik temelli malzemelerde bakım kullanımın kesintiye uğraması değil koşuludur.</w:t>
       </w:r>
     </w:p>
     <w:p>
@@ -2511,23 +2511,7 @@
           <w:sz w:val="24"/>
           <w:szCs w:val="24"/>
         </w:rPr>
-        <w:t xml:space="preserve">Değişkenliğin ikiz kavramı zamandır. Karana ve diğ. (2018), miselyum esaslı bir malzemeyle yürütülen tasarım sürecinde tasarımcının mikroorganizmanın failliği, malzemenin kendine özgü zamansallığı ve malzemenin toplum tarafından kabulü biçiminde üç belirsizlik kaynağıyla baş etmek durumunda kaldığını ortaya koymaktadır. Bunlardan ikincisi, büyüme, kuruma ve yaşlanma sürelerinin tasarım kararının dışında değil içinde olduğu anlamına gelir; ne var ki bu zamanın nasıl işlediği henüz büyük ölçüde bilinmemektedir (Chang ve diğ., 2020). Zamanı tasarıma dahil etmenin doğrudan sonucu, bakımın bir tasarım kararına dönüşmesidir. Graham ve Thrift (2007), modern toplumları ayakta tutan altyapıya ilişkin yerleşik kültürel kurguların onarım ve bakım etkinliklerini dikkat alanının dışına ittiğini ileri sürmektedir; biyolojik temelli malzemelerde bu dışarıda bırakma sürdürülemez, çünkü bakım kullanımın kesintiye uğraması değil koşuludur. Böylece biyotasarımın tasarım sürecine kattığı kavram kümesi belirginleşir: keşfedilecek bir malzeme potansiyeli, parametreye dönüşen bir değişkenlik, hesaba katılması gereken bir malzeme zamanı ve baştan kurgulanan bir bakım ilişkisi.</w:t>
-      </w:r>
-    </w:p>
-    <w:p>
-      <w:pPr>
-        <w:pStyle w:val="Heading2"/>
-        <w:spacing w:after="170" w:before="320" w:line="360"/>
-      </w:pPr>
-      <w:r>
-        <w:rPr>
-          <w:rFonts w:ascii="Times New Roman" w:cs="Times New Roman" w:eastAsia="Times New Roman" w:hAnsi="Times New Roman"/>
-          <w:b/>
-          <w:bCs/>
-          <w:sz w:val="24"/>
-          <w:szCs w:val="24"/>
-        </w:rPr>
-        <w:t xml:space="preserve">5.3. Dirençli iç mekânın tasarım özellikleri</w:t>
+        <w:t xml:space="preserve">Bu kavramların mekân ölçeğindeki karşılığı için önce bir ayrım gerekir. Walker ve diğ. (2004), dirençliliği sistemin bozulmayı soğurma ve yeniden örgütlenerek esasen aynı işlevi, yapıyı ve kimliği koruma kapasitesi; uyarlanabilirliği sistemdeki insan aktörlerin dirençliliği yönetme konusundaki ortak kapasitesi; dönüşebilirliği ise koşullar mevcut sistemi sürdürülemez kıldığında temelden yeni bir sistem yaratma kapasitesi olarak ayırt etmektedir. İç mimarlıkta bunlar sırasıyla mekânsal sistemin özelliği, kullanıcı ile tasarımcının kapasitesi ve mekânın bütünüyle başka bir kurguya geçebilme olanağıdır. Dirençliliğin hangi özelliklerle kurulduğu sorusuna ise Biggs ve diğ. (2012) yanıt vermektedir; yazarların ekosistem hizmetlerinin dirençliliğini güçlendirmek üzere tanımladığı yedi ilkenin ilk ikisi çeşitlilik ile yedekliliğin korunması ve bağlantısallığın yönetilmesidir. İç mekân ölçeğine aktarıldığında dört tasarım özelliği ortaya çıkar. Çeşitlilik ve yedeklilik, yerel bir bozulmanın bütüne yayılmasını engeller. Tersinir birleşimler bir bileşenin ötekini bozmadan değiştirilmesine olanak tanır; Rios ve diğ. (2015), sökülebilirlik için tasarım ilkelerine ilişkin kapsamlı kılavuzlar bulunmasına karşın bu alanda geliştirilmiş yapı sayısının çok az kaldığını belirtmektedir. Onarılabilirlik, bakımı kullanıcının yapabileceği bir işe dönüştürür. Uyarlanabilirlik ve dönüşebilirlik ise kurgunun yeniden düzenlenebilmesini ve gerektiğinde başka bir işleve geçebilmesini sağlar.</w:t>
       </w:r>
     </w:p>
     <w:p>
@@ -2541,63 +2525,7 @@
           <w:sz w:val="24"/>
           <w:szCs w:val="24"/>
         </w:rPr>
-        <w:t xml:space="preserve">Bu kavramların mekân ölçeğindeki karşılığı, dirençliliğin bir sistem özelliği olarak nasıl kurulacağı sorusudur. Soruyu yanıtlamadan önce bir kavram ayrımı gerekir. Walker ve diğ. (2004), sosyo-ekolojik sistemlerin geleceğini belirleyen üç ilişkili özelliği birbirinden ayırmaktadır: dirençlilik, bir sistemin bozulmayı soğurma ve değişim geçirirken yeniden örgütlenerek esasen aynı işlevi, yapıyı, kimliği ve geri besleme ilişkilerini koruma kapasitesidir; uyarlanabilirlik, sistemdeki insan aktörlerin dirençliliği yönetme konusundaki ortak kapasitesidir; dönüşebilirlik ise ekolojik, ekonomik ya da toplumsal koşullar mevcut sistemi sürdürülemez kıldığında temelden yeni bir sistem yaratma kapasitesidir. Ayrım iç mimarlık açısından doğrudan karşılık bulur: dirençlilik mekânsal sistemin bir özelliği, uyarlanabilirlik kullanıcı ve tasarımcının kapasitesi, dönüşebilirlik ise mekânın bütünüyle başka bir kurguya geçebilme olanağıdır.</w:t>
-      </w:r>
-    </w:p>
-    <w:p>
-      <w:pPr>
-        <w:spacing w:after="160" w:line="360"/>
-        <w:jc w:val="both"/>
-      </w:pPr>
-      <w:r>
-        <w:rPr>
-          <w:rFonts w:ascii="Times New Roman" w:cs="Times New Roman" w:eastAsia="Times New Roman" w:hAnsi="Times New Roman"/>
-          <w:sz w:val="24"/>
-          <w:szCs w:val="24"/>
-        </w:rPr>
-        <w:t xml:space="preserve">Dirençliliğin hangi tasarım özellikleriyle kurulduğu sorusuna ekolojik sistem araştırmaları kaynaklı bir yanıt vardır. Biggs ve diğ. (2012), ekosistem hizmetlerinin dirençliliğini güçlendirmeye yönelik yedi genel ilke tanımlamaktadır; bunların ilk üçü çeşitlilik ile yedekliliğin korunması, bağlantısallığın yönetilmesi ve yavaş değişkenler ile geri besleme ilişkilerinin yönetilmesidir. Yazarlara göre ilkeler pratikte çoğu kez birlikte görülür ve birbirine yüksek düzeyde bağımlıdır. Bu ilkeler iç mekân ölçeğine aktarıldığında dört tasarım özelliği ortaya çıkmaktadır.</w:t>
-      </w:r>
-    </w:p>
-    <w:p>
-      <w:pPr>
-        <w:spacing w:after="160" w:line="360"/>
-        <w:jc w:val="both"/>
-      </w:pPr>
-      <w:r>
-        <w:rPr>
-          <w:rFonts w:ascii="Times New Roman" w:cs="Times New Roman" w:eastAsia="Times New Roman" w:hAnsi="Times New Roman"/>
-          <w:sz w:val="24"/>
-          <w:szCs w:val="24"/>
-        </w:rPr>
-        <w:t xml:space="preserve">Birincisi çeşitlilik ve yedekliliktir. Tek bir malzemeye ve tek bir birleşim türüne dayanan bir iç mekân kurgusunda yerel bir bozulma bütüne yayılır; birden çok malzemenin ve birbirinin işlevini üstlenebilecek bileşenlerin bulunduğu bir kurguda ise bozulma yerel kalır. Yedeklilik burada fazlalık değil, bozulmanın yayılmasını engelleyen bir örgütlenme biçimidir. İkincisi bağlantısallıktır; ancak Biggs ve diğ.’nin (2012) formülasyonu bağlantısallığın artırılmasını değil yönetilmesini önermektedir. İç mekânda bu, bileşenlerin birbirine nasıl bağlandığı sorusudur: tersinir birleşimler bir bileşenin ötekini bozmadan değiştirilmesine olanak tanırken, kalıcı birleşimler bütün kurguyu tek bir karara bağlar. Rios ve diğ. (2015), sökülebilirlik için tasarım ilkelerine ilişkin kapsamlı kılavuzlar bulunmasına karşın bu alanda geliştirilmiş yapı sayısının çok az kaldığını belirtmektedir; boşluk, iç mekân ölçeğinde kapatılabilecek bir boşluktur.</w:t>
-      </w:r>
-    </w:p>
-    <w:p>
-      <w:pPr>
-        <w:spacing w:after="160" w:line="360"/>
-        <w:jc w:val="both"/>
-      </w:pPr>
-      <w:r>
-        <w:rPr>
-          <w:rFonts w:ascii="Times New Roman" w:cs="Times New Roman" w:eastAsia="Times New Roman" w:hAnsi="Times New Roman"/>
-          <w:sz w:val="24"/>
-          <w:szCs w:val="24"/>
-        </w:rPr>
-        <w:t xml:space="preserve">Üçüncüsü bakım ve onarılabilirliktir. Graham ve Thrift’in (2007) onarım ve bakımın görünmez kılınmasına ilişkin saptaması, iç mekânda doğrudan bir tasarım sorusuna dönüşür: bir bileşen onarılabilir mi, onarım izleri kabul edilebilir mi, bakım kullanıcının yapabileceği bir iş midir? Edalat (2026), döngüsel ekonominin kullanım, onarım ve yeniden kullanım aşamalarının yeterince araştırılmadığını ve büyük ölçüde bağlama bağlı olduğunu belirtmektedir. Dördüncüsü uyarlanabilirlik ve dönüşebilirliktir; Walker ve diğ.’nin (2004) ayrımı burada ölçüt üretir: bir iç mekân kurgusu kullanıcının onu yeniden düzenlemesine olanak tanıyorsa uyarlanabilir, bütünüyle başka bir işleve ve kurguya geçebiliyorsa dönüşebilirdir.</w:t>
-      </w:r>
-    </w:p>
-    <w:p>
-      <w:pPr>
-        <w:spacing w:after="160" w:line="360"/>
-        <w:jc w:val="both"/>
-      </w:pPr>
-      <w:r>
-        <w:rPr>
-          <w:rFonts w:ascii="Times New Roman" w:cs="Times New Roman" w:eastAsia="Times New Roman" w:hAnsi="Times New Roman"/>
-          <w:sz w:val="24"/>
-          <w:szCs w:val="24"/>
-        </w:rPr>
-        <w:t xml:space="preserve">Dört özelliğin tamamı, ölçekler arası bir okumayı gerektirmektedir. Goidea ve diğ. (2022), değişken ölçekler, sistemler ve malzemeler arasındaki karşılıklı bağımlılığın doğrusal olmayan etkileşimler ve hızla artan karmaşıklık ürettiğini belirtmektedir; bir bileşenin dirençliliği, bağlı olduğu sistemin dirençliliğinden ayrı değerlendirilemez. Buradan çıkan sonuç, döngüsellik ile dirençliliğin eş anlamlı olmadığı; ancak çeşitlilik, tersinir bağlantı, onarılabilirlik ve uyarlanabilirlik gibi ortak tasarım özellikleri üzerinden birbirini destekleyen iki yaklaşım oluşturduğudur. Yedinci başlıkta önerilen değerlendirme çerçevesinin dirençlilik boyutu bu dört özellik üzerine kurulmaktadır.</w:t>
+        <w:t xml:space="preserve">Dört özellik ancak ölçekler arası okunduğunda anlam kazanır. Goidea ve diğ. (2022), değişken ölçekler, sistemler ve malzemeler arasındaki karşılıklı bağımlılığın doğrusal olmayan etkileşimler ve hızla artan karmaşıklık ürettiğini belirtmektedir; dolayısıyla bir bileşenin dirençliliği, bağlı olduğu sistemin dirençliliğinden ayrı değerlendirilemez. Buradan çıkan sonuç, döngüsellik ile dirençliliğin eş anlamlı olmadığı; ancak çeşitlilik, tersinir bağlantı, onarılabilirlik ve uyarlanabilirlik gibi ortak tasarım özellikleri üzerinden birbirini destekleyen iki yaklaşım oluşturduğudur. Yedinci başlıkta önerilen değerlendirme çerçevesinin dirençlilik boyutu bu dört özellik üzerine kurulmaktadır.</w:t>
       </w:r>
     </w:p>
     <w:p>

</xml_diff>

<commit_message>
Beşinci bölümü üç alt başlıklı yapıyla toparla
- Bölüm adı "5. DİRENÇLİLİK" olarak kısaltıldı; alt başlıklar 5.1
  Dirençlilik kavramı, 5.2 Dirençli tasarım, 5.3 Dirençlilik öznitelikleri
- 5.2'nin açılışındaki kendini yineleyen iki anlatım tek girişte
  birleştirildi
- 5.3 iç mekân ölçeğinde değil tasarım sistemi ölçeğinde kuruldu; böylece
  altıncı bölümü önceden tüketmiyor ve son cümlede ona devrediyor
- Walker ve diğ.'nin üçlü ayrımı 5.3'ün giriş paragrafına taşındı
- Askar ve diğ. (2021) eklendi: uyarlanabilirlik kavramının yapı
  araştırmalarındaki karşılığının yerleşmediğini gösteriyor
- Bölüm 1.180 kelimeden 870 kelimeye indi; kaynak sayısı 29

Co-Authored-By: Claude Opus 5 <noreply@anthropic.com>
Claude-Session: https://claude.ai/code/session_01A7bv5SYpnVudfqWACh8kXV
</commit_message>
<xml_diff>
--- a/Kitap_Bolumu_Biyotasarim_Malzeme_Secimi.docx
+++ b/Kitap_Bolumu_Biyotasarim_Malzeme_Secimi.docx
@@ -2409,7 +2409,7 @@
           <w:sz w:val="26"/>
           <w:szCs w:val="26"/>
         </w:rPr>
-        <w:t xml:space="preserve">5. ADAPTASYON, DEĞİŞKENLİK VE DİRENÇLİLİK</w:t>
+        <w:t xml:space="preserve">5. DİRENÇLİLİK</w:t>
       </w:r>
     </w:p>
     <w:p>
@@ -2423,7 +2423,7 @@
           <w:sz w:val="24"/>
           <w:szCs w:val="24"/>
         </w:rPr>
-        <w:t xml:space="preserve">Önceki başlıkta döngüselliğin biyolojik kökenle güvence altına alınamayacağı ortaya konmuştu. Bu başlıkta tartışma bir adım ileri taşınarak, biyolojik temelli malzemelerin tasarım sürecine taşıdığı üç özellik — adaptasyon, değişkenlik ve zamansallık — dirençlilik kavramı üzerinden ele alınmaktadır.</w:t>
+        <w:t xml:space="preserve">Önceki başlıkta döngüselliğin biyolojik kökenle güvence altına alınamayacağı ortaya konmuştu. Bu başlıkta tartışma bir adım ileri taşınarak, biyolojik temelli malzemelerin tasarım sürecine etkileri dirençlilik kavramı üzerinden ele alınmaktadır.</w:t>
       </w:r>
     </w:p>
     <w:p>
@@ -2439,7 +2439,7 @@
           <w:sz w:val="24"/>
           <w:szCs w:val="24"/>
         </w:rPr>
-        <w:t xml:space="preserve">5.1. Dirençliliğin iki tanımı</w:t>
+        <w:t xml:space="preserve">5.1. Dirençlilik kavramı</w:t>
       </w:r>
     </w:p>
     <w:p>
@@ -2453,7 +2453,7 @@
           <w:sz w:val="24"/>
           <w:szCs w:val="24"/>
         </w:rPr>
-        <w:t xml:space="preserve">Dirençlilik kavramı yapılı çevre literatüründe birbirinden önemli ölçüde farklı iki anlamda kullanılmaktadır. Heymans ve diğ. (2019), ekolojik kentsel planlama ve tasarım literatürünü 57 makale üzerinden sistematik olarak inceledikleri çalışmalarında bu iki tanımı ayırt etmektedir. Eski tanım, bir sistemin bozulmanın ardından dengeye dönme yeteneğine işaret eder ve yazarlara göre sistemlerin verimliliğine ve öngörülebilirliğine odaklanması bakımından modernist paradigmayla tutarlıdır. Daha yeni tanım ise denge dışı karmaşık uyarlanabilir sistemlerle ilişkilidir ve dirençliliği, bir sistemin temel yapısını ve işlevini sürdürürken değişimi soğurma ve değişime uyarlanma yeteneği olarak vurgular. İkinci tanımın kaynağı sosyo-ekolojik sistem araştırmalarıdır; Folke (2006), dirençliliği bir sistemin bozulmayı soğurma ve zaman içinde aynı temel yapı ile işlevi koruyarak yeniden örgütlenme kapasitesi olarak tanımlamaktadır. Andréen ve Goidea (2022) aynı ayrımı malzeme ölçeğinde kurmakta; mühendislik dirençliliği olarak adlandırılan birinci tanımın daha çok doğrusal sistemler ile değişime direnmenin amaçlandığı bağlamlar için geçerli olduğunu belirtmektedir.</w:t>
+        <w:t xml:space="preserve">Dirençlilik kavramı yapılı çevre literatüründe birbirinden önemli ölçüde farklı iki anlamda kullanılmaktadır. Heymans ve diğ. (2019), ekolojik kentsel planlama ve tasarım literatürünü sistematik olarak inceledikleri çalışmalarında bu iki tanımı ayırt etmektedir. Eski tanım, bir sistemin bozulmanın ardından dengeye dönme yeteneğine işaret eder ve yazarlara göre sistemlerin verimliliğine ve öngörülebilirliğine odaklanması bakımından modernist paradigmayla tutarlıdır. Daha yeni tanım ise denge dışı karmaşık uyarlanabilir sistemlerle ilişkilidir ve dirençliliği, bir sistemin temel yapısını ve işlevini sürdürürken değişimi soğurma ve değişime uyarlanma yeteneği olarak vurgular. İkinci tanımın kaynağı sosyo-ekolojik sistem araştırmalarıdır; Folke (2006), dirençliliği bir sistemin bozulmayı soğurma ve zaman içinde aynı temel yapı ile işlevi koruyarak yeniden örgütlenme kapasitesi olarak tanımlamaktadır.</w:t>
       </w:r>
     </w:p>
     <w:p>
@@ -2483,7 +2483,7 @@
           <w:sz w:val="24"/>
           <w:szCs w:val="24"/>
         </w:rPr>
-        <w:t xml:space="preserve">5.2. Biyomalzemeden dirençli mekâna</w:t>
+        <w:t xml:space="preserve">5.2. Dirençli tasarım</w:t>
       </w:r>
     </w:p>
     <w:p>
@@ -2497,7 +2497,7 @@
           <w:sz w:val="24"/>
           <w:szCs w:val="24"/>
         </w:rPr>
-        <w:t xml:space="preserve">Dirençliliğin ne anlama geldiği belirlendikten sonra sorulması gereken soru şudur: biyolojik temelli malzemeler tasarım sürecine girdiğinde bu süreçte ne değişir? Değişimin ilk durağı tasarımcının konumudur. Barati ve Karana (2019), tasarımcı ile malzeme bilimcisi arasındaki erken aşama ortak projelerini inceledikleri çalışmalarında yaratıcılığın tasarımcının zihnine ait bir yeti olmadığını, tasarımcı ile maddi dünya arasında dağılmış bir süreç olduğunu ileri sürmekte; geliştirdikleri malzeme potansiyeli olarak olanaklar kavramıyla odağı tasarımcının yapma ve üretme edimlerine kaydırmaktadır. Tasarımcının işi böylece bir listeden seçim yapmak değil, malzemenin neye olanak tanıdığını üretim yoluyla keşfetmek hâline gelir; keşfedilen şey ise çoğu zaman değişkenliktir. Goidea ve diğ. (2022), miselyum biyokompozitlerde tür seçiminin hem üretim sürecini hem nesnenin performansını değiştirdiğini göstermektedir; değişkenlik burada bir kusur değil, tasarımcının üzerinde çalıştığı parametre kümesidir. Değişkenliğin ikizi ise zamandır: Karana ve diğ. (2018), malzemenin kendine özgü zamansallığını tasarımcının baş etmek zorunda olduğu üç belirsizlikten biri olarak saymakta; Chang ve diğ. (2020) bu zamanın nasıl işlediğine ilişkin bilginin oldukça sınırlı kaldığını ortaya koymaktadır. Zamanın tasarıma girmesinin doğrudan sonucu, bakımın bir tasarım kararına dönüşmesidir; Graham ve Thrift (2007), yerleşik kültürel kurguların onarım ve bakımı dikkat alanının dışına ittiğini belirtmektedir, oysa biyolojik temelli malzemelerde bakım kullanımın kesintiye uğraması değil koşuludur.</w:t>
+        <w:t xml:space="preserve">Biyolojik temelli malzemelerin tasarım sürecine dâhil edilmesi, yalnızca kullanılan malzemenin niteliğini değil tasarımcının bu süreçteki konumunu da dönüştürmektedir. Geleneksel yaklaşımda malzeme, verilmiş tasarım kararları doğrultusunda seçilen ve biçimlendirilen bir unsurdur; biyolojik temelli malzemeler ise değişkenlikleri, zamansallıkları ve üretim koşullarındaki belirsizlikleriyle bu kararların yeniden değerlendirilmesini gerektirir. Barati ve Karana (2019), tasarımcı ile malzeme bilimcisi arasındaki erken aşama ortak projelerini inceledikleri çalışmalarında yaratıcılığın tasarımcının zihnine ait bir yeti olmadığını, tasarımcı ile maddi dünya arasında dağılmış bir süreç olduğunu ileri sürmekte; geliştirdikleri malzeme potansiyeli olarak olanaklar kavramıyla odağı tasarımcının yapma ve üretme edimlerine kaydırmaktadır. Tasarımcının işi böylece bir listeden seçim yapmak değil, malzemenin neye olanak tanıdığını üretim yoluyla keşfetmek hâline gelir; keşfedilen şey ise çoğu zaman malzemenin değişkenliğidir. Goidea ve diğ. (2022), miselyum biyokompozitlerde tür seçiminin hem üretim sürecini hem nesnenin performansını değiştirdiğini; büyüme hızı ve genetik kararlılığın yanı sıra dayanım, ısı iletkenliği ve görünüm gibi etkenlerin birlikte devreye girdiğini göstermektedir. Değişkenlik bu çerçevede bir kusur değil, tasarımcının üzerinde çalıştığı parametre kümesidir.</w:t>
       </w:r>
     </w:p>
     <w:p>
@@ -2511,7 +2511,23 @@
           <w:sz w:val="24"/>
           <w:szCs w:val="24"/>
         </w:rPr>
-        <w:t xml:space="preserve">Bu kavramların mekân ölçeğindeki karşılığı için önce bir ayrım gerekir. Walker ve diğ. (2004), dirençliliği sistemin bozulmayı soğurma ve yeniden örgütlenerek esasen aynı işlevi, yapıyı ve kimliği koruma kapasitesi; uyarlanabilirliği sistemdeki insan aktörlerin dirençliliği yönetme konusundaki ortak kapasitesi; dönüşebilirliği ise koşullar mevcut sistemi sürdürülemez kıldığında temelden yeni bir sistem yaratma kapasitesi olarak ayırt etmektedir. İç mimarlıkta bunlar sırasıyla mekânsal sistemin özelliği, kullanıcı ile tasarımcının kapasitesi ve mekânın bütünüyle başka bir kurguya geçebilme olanağıdır. Dirençliliğin hangi özelliklerle kurulduğu sorusuna ise Biggs ve diğ. (2012) yanıt vermektedir; yazarların ekosistem hizmetlerinin dirençliliğini güçlendirmek üzere tanımladığı yedi ilkenin ilk ikisi çeşitlilik ile yedekliliğin korunması ve bağlantısallığın yönetilmesidir. İç mekân ölçeğine aktarıldığında dört tasarım özelliği ortaya çıkar. Çeşitlilik ve yedeklilik, yerel bir bozulmanın bütüne yayılmasını engeller. Tersinir birleşimler bir bileşenin ötekini bozmadan değiştirilmesine olanak tanır; Rios ve diğ. (2015), sökülebilirlik için tasarım ilkelerine ilişkin kapsamlı kılavuzlar bulunmasına karşın bu alanda geliştirilmiş yapı sayısının çok az kaldığını belirtmektedir. Onarılabilirlik, bakımı kullanıcının yapabileceği bir işe dönüştürür. Uyarlanabilirlik ve dönüşebilirlik ise kurgunun yeniden düzenlenebilmesini ve gerektiğinde başka bir işleve geçebilmesini sağlar.</w:t>
+        <w:t xml:space="preserve">Değişkenliğin ikiz kavramı zamandır. Karana ve diğ. (2018), miselyum esaslı bir malzemeyle yürütülen tasarım sürecinde tasarımcının mikroorganizmanın failliği, malzemenin kendine özgü zamansallığı ve malzemenin toplum tarafından kabulü biçiminde üç belirsizlik kaynağıyla baş etmek durumunda kaldığını ortaya koymaktadır. İkincisi, büyüme, kuruma ve yaşlanma sürelerinin tasarım kararının dışında değil içinde olduğu anlamına gelir; ne var ki bu zamanın nasıl işlediğine ilişkin bilgi hâlâ sınırlıdır (Chang ve diğ., 2020). Zamanın tasarıma girmesinin doğrudan sonucu, bakımın bir tasarım kararına dönüşmesidir. Graham ve Thrift (2007), modern toplumları ayakta tutan altyapıya ilişkin yerleşik kültürel kurguların onarım ve bakım etkinliklerini dikkat alanının dışına ittiğini ileri sürmektedir; biyolojik temelli malzemelerde bu dışarıda bırakma sürdürülemez, çünkü bakım kullanımın kesintiye uğraması değil koşuludur. Dirençli tasarım böylece önce bir kavram kümesi üretmektedir: keşfedilecek bir malzeme potansiyeli, parametreye dönüşen bir değişkenlik, hesaba katılması gereken bir malzeme zamanı ve baştan kurgulanan bir bakım ilişkisi.</w:t>
+      </w:r>
+    </w:p>
+    <w:p>
+      <w:pPr>
+        <w:pStyle w:val="Heading2"/>
+        <w:spacing w:after="170" w:before="320" w:line="360"/>
+      </w:pPr>
+      <w:r>
+        <w:rPr>
+          <w:rFonts w:ascii="Times New Roman" w:cs="Times New Roman" w:eastAsia="Times New Roman" w:hAnsi="Times New Roman"/>
+          <w:b/>
+          <w:bCs/>
+          <w:sz w:val="24"/>
+          <w:szCs w:val="24"/>
+        </w:rPr>
+        <w:t xml:space="preserve">5.3. Dirençlilik öznitelikleri</w:t>
       </w:r>
     </w:p>
     <w:p>
@@ -2525,7 +2541,49 @@
           <w:sz w:val="24"/>
           <w:szCs w:val="24"/>
         </w:rPr>
-        <w:t xml:space="preserve">Dört özellik ancak ölçekler arası okunduğunda anlam kazanır. Goidea ve diğ. (2022), değişken ölçekler, sistemler ve malzemeler arasındaki karşılıklı bağımlılığın doğrusal olmayan etkileşimler ve hızla artan karmaşıklık ürettiğini belirtmektedir; dolayısıyla bir bileşenin dirençliliği, bağlı olduğu sistemin dirençliliğinden ayrı değerlendirilemez. Buradan çıkan sonuç, döngüsellik ile dirençliliğin eş anlamlı olmadığı; ancak çeşitlilik, tersinir bağlantı, onarılabilirlik ve uyarlanabilirlik gibi ortak tasarım özellikleri üzerinden birbirini destekleyen iki yaklaşım oluşturduğudur. Yedinci başlıkta önerilen değerlendirme çerçevesinin dirençlilik boyutu bu dört özellik üzerine kurulmaktadır.</w:t>
+        <w:t xml:space="preserve">Bu kavram kümesinin tasarım özelliklerine çevrilebilmesi için ekolojik dirençlilik araştırmaları bir dayanak sunmaktadır. Biggs ve diğ. (2012), ekosistem hizmetlerinin dirençliliğini güçlendirmeye yönelik yedi genel ilke tanımlamakta; bunların ilk üçünü çeşitlilik ile yedekliliğin korunması, bağlantısallığın yönetilmesi ve yavaş değişkenler ile geri besleme ilişkilerinin yönetilmesi olarak sıralamaktadır. Yazarlara göre ilkeler pratikte çoğu kez birlikte görülür ve birbirine yüksek düzeyde bağımlıdır. Söz konusu ilkeler, Walker ve diğ.’nin (2004) dirençlilik, uyarlanabilirlik ve dönüşebilirlik ayrımıyla birlikte okunduğunda, biyolojik temelli malzemelerle kurulan tasarım sistemleri için dört öznitelik üretmektedir.</w:t>
+      </w:r>
+    </w:p>
+    <w:p>
+      <w:pPr>
+        <w:spacing w:after="160" w:line="360"/>
+        <w:jc w:val="both"/>
+      </w:pPr>
+      <w:r>
+        <w:rPr>
+          <w:rFonts w:ascii="Times New Roman" w:cs="Times New Roman" w:eastAsia="Times New Roman" w:hAnsi="Times New Roman"/>
+          <w:sz w:val="24"/>
+          <w:szCs w:val="24"/>
+        </w:rPr>
+        <w:t xml:space="preserve">Birincisi çeşitlilik ve yedekliliktir. Tek bir malzemeye ve tek bir birleşim türüne dayanan bir kurguda yerel bir bozulma bütüne yayılırken, birden çok malzemenin ve birbirinin işlevini üstlenebilecek bileşenlerin bulunduğu bir kurguda bozulma yerel kalır; yedeklilik burada fazlalık değil, bozulmanın yayılmasını engelleyen bir örgütlenme biçimidir. İkincisi bağlantısallıktır; Biggs ve diğ.’nin (2012) formülasyonu bağlantısallığın artırılmasını değil yönetilmesini önermektedir. Tasarımda bu, bileşenlerin birbirine nasıl bağlandığı sorusudur: tersinir birleşimler bir bileşenin ötekini bozmadan değiştirilmesine olanak tanırken, kalıcı birleşimler bütün kurguyu tek bir karara bağlar. Rios ve diğ. (2015), sökülebilirlik için tasarım ilkelerine ilişkin kapsamlı kılavuzlar bulunmasına karşın bu alanda geliştirilmiş yapı sayısının çok az kaldığını belirtmektedir.</w:t>
+      </w:r>
+    </w:p>
+    <w:p>
+      <w:pPr>
+        <w:spacing w:after="160" w:line="360"/>
+        <w:jc w:val="both"/>
+      </w:pPr>
+      <w:r>
+        <w:rPr>
+          <w:rFonts w:ascii="Times New Roman" w:cs="Times New Roman" w:eastAsia="Times New Roman" w:hAnsi="Times New Roman"/>
+          <w:sz w:val="24"/>
+          <w:szCs w:val="24"/>
+        </w:rPr>
+        <w:t xml:space="preserve">Üçüncüsü bakım ve onarılabilirliktir; önceki alt başlıkta kurulan bakım ilişkisi burada bir özniteliğe dönüşür ve bileşenin onarılabilir olup olmadığı, onarım izlerinin kabul edilip edilmediği ve bakımın kim tarafından yapılabileceği sorularında somutlaşır. Dördüncüsü uyarlanabilirlik ve dönüşebilirliktir. Walker ve diğ. (2004), uyarlanabilirliği sistemdeki insan aktörlerin dirençliliği yönetme konusundaki ortak kapasitesi, dönüşebilirliği ise koşullar mevcut sistemi sürdürülemez kıldığında temelden yeni bir sistem yaratma kapasitesi olarak tanımlamaktadır. Kavramın yapı araştırmalarındaki karşılığının yerleşmediği de belirtilmelidir; Askar ve diğ. (2021), uyarlanabilirlik kavramına ilişkin yorumların ve bunlara bağlı paradigmaların zaman içinde değiştiğini, uygulama ve stratejilerin de bu değişimle birlikte geliştiğini ortaya koymaktadır.</w:t>
+      </w:r>
+    </w:p>
+    <w:p>
+      <w:pPr>
+        <w:spacing w:after="160" w:line="360"/>
+        <w:jc w:val="both"/>
+      </w:pPr>
+      <w:r>
+        <w:rPr>
+          <w:rFonts w:ascii="Times New Roman" w:cs="Times New Roman" w:eastAsia="Times New Roman" w:hAnsi="Times New Roman"/>
+          <w:sz w:val="24"/>
+          <w:szCs w:val="24"/>
+        </w:rPr>
+        <w:t xml:space="preserve">Dört öznitelik ancak ölçekler arası okunduğunda anlam kazanır. Goidea ve diğ. (2022), değişken ölçekler, sistemler ve malzemeler arasındaki karşılıklı bağımlılığın doğrusal olmayan etkileşimler ve hızla artan karmaşıklık ürettiğini belirtmektedir; bir bileşenin dirençliliği, bağlı olduğu sistemin dirençliliğinden ayrı değerlendirilemez. Buradan iki sonuç çıkmaktadır. Birincisi, döngüsellik ile dirençlilik eş anlamlı değildir; ancak çeşitlilik, tersinir bağlantı, onarılabilirlik ve uyarlanabilirlik gibi ortak özellikler üzerinden birbirini destekleyen iki yaklaşım oluştururlar. İkincisi, dört öznitelik de ancak kullanıldıkları, bakıldıkları ve değiştirildikleri ölçekte sınanabilir. İzleyen başlıkta gösterileceği gibi bu ölçek, büyük ölçüde iç mekândır.</w:t>
       </w:r>
     </w:p>
     <w:p>
@@ -4894,6 +4952,43 @@
           <w:szCs w:val="24"/>
         </w:rPr>
         <w:t xml:space="preserve">, 481–491. https://doi.org/10.1007/s44150-022-00049-6</w:t>
+      </w:r>
+    </w:p>
+    <w:p>
+      <w:pPr>
+        <w:spacing w:after="140" w:line="360"/>
+        <w:ind w:left="567" w:hanging="567"/>
+        <w:jc w:val="left"/>
+      </w:pPr>
+      <w:r>
+        <w:rPr>
+          <w:rFonts w:ascii="Times New Roman" w:cs="Times New Roman" w:eastAsia="Times New Roman" w:hAnsi="Times New Roman"/>
+          <w:i w:val="false"/>
+          <w:iCs w:val="false"/>
+          <w:sz w:val="24"/>
+          <w:szCs w:val="24"/>
+        </w:rPr>
+        <w:t xml:space="preserve">Askar, R., Bragança, L. ve Gervásio, H. (2021). Adaptability of buildings: A critical review on the concept evolution. </w:t>
+      </w:r>
+      <w:r>
+        <w:rPr>
+          <w:rFonts w:ascii="Times New Roman" w:cs="Times New Roman" w:eastAsia="Times New Roman" w:hAnsi="Times New Roman"/>
+          <w:i/>
+          <w:iCs/>
+          <w:sz w:val="24"/>
+          <w:szCs w:val="24"/>
+        </w:rPr>
+        <w:t xml:space="preserve">Applied Sciences, 11</w:t>
+      </w:r>
+      <w:r>
+        <w:rPr>
+          <w:rFonts w:ascii="Times New Roman" w:cs="Times New Roman" w:eastAsia="Times New Roman" w:hAnsi="Times New Roman"/>
+          <w:i w:val="false"/>
+          <w:iCs w:val="false"/>
+          <w:sz w:val="24"/>
+          <w:szCs w:val="24"/>
+        </w:rPr>
+        <w:t xml:space="preserve">(10), 4483. https://doi.org/10.3390/app11104483</w:t>
       </w:r>
     </w:p>
     <w:p>

</xml_diff>

<commit_message>
Tablo 3'te üst simgeli dipnotları metin içi atıflara çevir
On üç üst simge numarası ve tablo altındaki dipnot satırı kaldırıldı;
kaynaklar ilgili ifadenin yanında, hücre metniyle aynı puntoda parantez
içinde verildi. Tablo ayrıca tek başına Tablo_3.docx olarak çıkarıldı;
iki dosya aynı tablo tanımını paylaşıyor.

Co-Authored-By: Claude Opus 5 <noreply@anthropic.com>
Claude-Session: https://claude.ai/code/session_01A7bv5SYpnVudfqWACh8kXV
</commit_message>
<xml_diff>
--- a/Kitap_Bolumu_Biyotasarim_Malzeme_Secimi.docx
+++ b/Kitap_Bolumu_Biyotasarim_Malzeme_Secimi.docx
@@ -2859,9 +2859,9 @@
         </w:tblBorders>
       </w:tblPr>
       <w:tblGrid>
-        <w:gridCol w:w="1300"/>
-        <w:gridCol w:w="3863"/>
-        <w:gridCol w:w="3863"/>
+        <w:gridCol w:w="1250"/>
+        <w:gridCol w:w="3888"/>
+        <w:gridCol w:w="3888"/>
       </w:tblGrid>
       <w:tr>
         <w:trPr>
@@ -2869,7 +2869,7 @@
         </w:trPr>
         <w:tc>
           <w:tcPr>
-            <w:tcW w:type="dxa" w:w="1300"/>
+            <w:tcW w:type="dxa" w:w="1250"/>
             <w:shd w:fill="ECECEC" w:color="auto" w:val="clear"/>
             <w:tcMar>
               <w:top w:type="dxa" w:w="80"/>
@@ -2894,7 +2894,7 @@
         </w:tc>
         <w:tc>
           <w:tcPr>
-            <w:tcW w:type="dxa" w:w="3863"/>
+            <w:tcW w:type="dxa" w:w="3888"/>
             <w:shd w:fill="ECECEC" w:color="auto" w:val="clear"/>
             <w:tcMar>
               <w:top w:type="dxa" w:w="80"/>
@@ -2919,7 +2919,7 @@
         </w:tc>
         <w:tc>
           <w:tcPr>
-            <w:tcW w:type="dxa" w:w="3863"/>
+            <w:tcW w:type="dxa" w:w="3888"/>
             <w:shd w:fill="ECECEC" w:color="auto" w:val="clear"/>
             <w:tcMar>
               <w:top w:type="dxa" w:w="80"/>
@@ -2946,7 +2946,7 @@
       <w:tr>
         <w:tc>
           <w:tcPr>
-            <w:tcW w:type="dxa" w:w="1300"/>
+            <w:tcW w:type="dxa" w:w="1250"/>
             <w:tcMar>
               <w:top w:type="dxa" w:w="80"/>
               <w:left w:type="dxa" w:w="110"/>
@@ -2970,49 +2970,49 @@
         </w:tc>
         <w:tc>
           <w:tcPr>
-            <w:tcW w:type="dxa" w:w="3863"/>
-            <w:tcMar>
-              <w:top w:type="dxa" w:w="80"/>
-              <w:left w:type="dxa" w:w="110"/>
-              <w:bottom w:type="dxa" w:w="80"/>
-              <w:right w:type="dxa" w:w="110"/>
-            </w:tcMar>
-          </w:tcPr>
-          <w:p>
-            <w:pPr>
-              <w:spacing w:after="0" w:line="240"/>
-            </w:pPr>
-            <w:r>
-              <w:rPr>
-                <w:rFonts w:ascii="Times New Roman" w:cs="Times New Roman" w:eastAsia="Times New Roman" w:hAnsi="Times New Roman"/>
-                <w:sz w:val="19"/>
-                <w:szCs w:val="19"/>
-              </w:rPr>
-              <w:t xml:space="preserve">Değerlendirilemeyen biyokütlenin alternatif hammaddeye dönüşmesi¹; atık alt tabaka ile organizma bileşiminin tasarlanabilmesi²</w:t>
-            </w:r>
-          </w:p>
-        </w:tc>
-        <w:tc>
-          <w:tcPr>
-            <w:tcW w:type="dxa" w:w="3863"/>
-            <w:tcMar>
-              <w:top w:type="dxa" w:w="80"/>
-              <w:left w:type="dxa" w:w="110"/>
-              <w:bottom w:type="dxa" w:w="80"/>
-              <w:right w:type="dxa" w:w="110"/>
-            </w:tcMar>
-          </w:tcPr>
-          <w:p>
-            <w:pPr>
-              <w:spacing w:after="0" w:line="240"/>
-            </w:pPr>
-            <w:r>
-              <w:rPr>
-                <w:rFonts w:ascii="Times New Roman" w:cs="Times New Roman" w:eastAsia="Times New Roman" w:hAnsi="Times New Roman"/>
-                <w:sz w:val="19"/>
-                <w:szCs w:val="19"/>
-              </w:rPr>
-              <w:t xml:space="preserve">Kısıtlı hammadde kaynakları; bitkisel malzeme maliyetlerinin ülkeden ülkeye değişkenliği³</w:t>
+            <w:tcW w:type="dxa" w:w="3888"/>
+            <w:tcMar>
+              <w:top w:type="dxa" w:w="80"/>
+              <w:left w:type="dxa" w:w="110"/>
+              <w:bottom w:type="dxa" w:w="80"/>
+              <w:right w:type="dxa" w:w="110"/>
+            </w:tcMar>
+          </w:tcPr>
+          <w:p>
+            <w:pPr>
+              <w:spacing w:after="0" w:line="240"/>
+            </w:pPr>
+            <w:r>
+              <w:rPr>
+                <w:rFonts w:ascii="Times New Roman" w:cs="Times New Roman" w:eastAsia="Times New Roman" w:hAnsi="Times New Roman"/>
+                <w:sz w:val="19"/>
+                <w:szCs w:val="19"/>
+              </w:rPr>
+              <w:t xml:space="preserve">Değerlendirilemeyen biyokütlenin alternatif hammaddeye dönüşmesi (Lee ve diğ., 2022); atık alt tabaka ile organizma bileşiminin tasarlanabilmesi (Attias ve diğ., 2020)</w:t>
+            </w:r>
+          </w:p>
+        </w:tc>
+        <w:tc>
+          <w:tcPr>
+            <w:tcW w:type="dxa" w:w="3888"/>
+            <w:tcMar>
+              <w:top w:type="dxa" w:w="80"/>
+              <w:left w:type="dxa" w:w="110"/>
+              <w:bottom w:type="dxa" w:w="80"/>
+              <w:right w:type="dxa" w:w="110"/>
+            </w:tcMar>
+          </w:tcPr>
+          <w:p>
+            <w:pPr>
+              <w:spacing w:after="0" w:line="240"/>
+            </w:pPr>
+            <w:r>
+              <w:rPr>
+                <w:rFonts w:ascii="Times New Roman" w:cs="Times New Roman" w:eastAsia="Times New Roman" w:hAnsi="Times New Roman"/>
+                <w:sz w:val="19"/>
+                <w:szCs w:val="19"/>
+              </w:rPr>
+              <w:t xml:space="preserve">Kısıtlı hammadde kaynakları; bitkisel malzeme maliyetlerinin ülkeden ülkeye değişkenliği (Edalat, 2026)</w:t>
             </w:r>
           </w:p>
         </w:tc>
@@ -3020,7 +3020,7 @@
       <w:tr>
         <w:tc>
           <w:tcPr>
-            <w:tcW w:type="dxa" w:w="1300"/>
+            <w:tcW w:type="dxa" w:w="1250"/>
             <w:tcMar>
               <w:top w:type="dxa" w:w="80"/>
               <w:left w:type="dxa" w:w="110"/>
@@ -3044,49 +3044,49 @@
         </w:tc>
         <w:tc>
           <w:tcPr>
-            <w:tcW w:type="dxa" w:w="3863"/>
-            <w:tcMar>
-              <w:top w:type="dxa" w:w="80"/>
-              <w:left w:type="dxa" w:w="110"/>
-              <w:bottom w:type="dxa" w:w="80"/>
-              <w:right w:type="dxa" w:w="110"/>
-            </w:tcMar>
-          </w:tcPr>
-          <w:p>
-            <w:pPr>
-              <w:spacing w:after="0" w:line="240"/>
-            </w:pPr>
-            <w:r>
-              <w:rPr>
-                <w:rFonts w:ascii="Times New Roman" w:cs="Times New Roman" w:eastAsia="Times New Roman" w:hAnsi="Times New Roman"/>
-                <w:sz w:val="19"/>
-                <w:szCs w:val="19"/>
-              </w:rPr>
-              <w:t xml:space="preserve">Yenilenebilirlik ve düşük gömülü enerji⁴</w:t>
-            </w:r>
-          </w:p>
-        </w:tc>
-        <w:tc>
-          <w:tcPr>
-            <w:tcW w:type="dxa" w:w="3863"/>
-            <w:tcMar>
-              <w:top w:type="dxa" w:w="80"/>
-              <w:left w:type="dxa" w:w="110"/>
-              <w:bottom w:type="dxa" w:w="80"/>
-              <w:right w:type="dxa" w:w="110"/>
-            </w:tcMar>
-          </w:tcPr>
-          <w:p>
-            <w:pPr>
-              <w:spacing w:after="0" w:line="240"/>
-            </w:pPr>
-            <w:r>
-              <w:rPr>
-                <w:rFonts w:ascii="Times New Roman" w:cs="Times New Roman" w:eastAsia="Times New Roman" w:hAnsi="Times New Roman"/>
-                <w:sz w:val="19"/>
-                <w:szCs w:val="19"/>
-              </w:rPr>
-              <w:t xml:space="preserve">Yüksek maliyetler; merkezsiz ve parçalı tedarik zincirleri³</w:t>
+            <w:tcW w:type="dxa" w:w="3888"/>
+            <w:tcMar>
+              <w:top w:type="dxa" w:w="80"/>
+              <w:left w:type="dxa" w:w="110"/>
+              <w:bottom w:type="dxa" w:w="80"/>
+              <w:right w:type="dxa" w:w="110"/>
+            </w:tcMar>
+          </w:tcPr>
+          <w:p>
+            <w:pPr>
+              <w:spacing w:after="0" w:line="240"/>
+            </w:pPr>
+            <w:r>
+              <w:rPr>
+                <w:rFonts w:ascii="Times New Roman" w:cs="Times New Roman" w:eastAsia="Times New Roman" w:hAnsi="Times New Roman"/>
+                <w:sz w:val="19"/>
+                <w:szCs w:val="19"/>
+              </w:rPr>
+              <w:t xml:space="preserve">Yenilenebilirlik ve düşük gömülü enerji (Bourbia ve diğ., 2023)</w:t>
+            </w:r>
+          </w:p>
+        </w:tc>
+        <w:tc>
+          <w:tcPr>
+            <w:tcW w:type="dxa" w:w="3888"/>
+            <w:tcMar>
+              <w:top w:type="dxa" w:w="80"/>
+              <w:left w:type="dxa" w:w="110"/>
+              <w:bottom w:type="dxa" w:w="80"/>
+              <w:right w:type="dxa" w:w="110"/>
+            </w:tcMar>
+          </w:tcPr>
+          <w:p>
+            <w:pPr>
+              <w:spacing w:after="0" w:line="240"/>
+            </w:pPr>
+            <w:r>
+              <w:rPr>
+                <w:rFonts w:ascii="Times New Roman" w:cs="Times New Roman" w:eastAsia="Times New Roman" w:hAnsi="Times New Roman"/>
+                <w:sz w:val="19"/>
+                <w:szCs w:val="19"/>
+              </w:rPr>
+              <w:t xml:space="preserve">Yüksek maliyetler; merkezsiz ve parçalı tedarik zincirleri (Edalat, 2026)</w:t>
             </w:r>
           </w:p>
         </w:tc>
@@ -3094,7 +3094,7 @@
       <w:tr>
         <w:tc>
           <w:tcPr>
-            <w:tcW w:type="dxa" w:w="1300"/>
+            <w:tcW w:type="dxa" w:w="1250"/>
             <w:tcMar>
               <w:top w:type="dxa" w:w="80"/>
               <w:left w:type="dxa" w:w="110"/>
@@ -3118,49 +3118,49 @@
         </w:tc>
         <w:tc>
           <w:tcPr>
-            <w:tcW w:type="dxa" w:w="3863"/>
-            <w:tcMar>
-              <w:top w:type="dxa" w:w="80"/>
-              <w:left w:type="dxa" w:w="110"/>
-              <w:bottom w:type="dxa" w:w="80"/>
-              <w:right w:type="dxa" w:w="110"/>
-            </w:tcMar>
-          </w:tcPr>
-          <w:p>
-            <w:pPr>
-              <w:spacing w:after="0" w:line="240"/>
-            </w:pPr>
-            <w:r>
-              <w:rPr>
-                <w:rFonts w:ascii="Times New Roman" w:cs="Times New Roman" w:eastAsia="Times New Roman" w:hAnsi="Times New Roman"/>
-                <w:sz w:val="19"/>
-                <w:szCs w:val="19"/>
-              </w:rPr>
-              <w:t xml:space="preserve">Isıl düzenleme kapasitesi⁴; mineral yalıtkanlarla karşılaştırılabilir ısıl performans³</w:t>
-            </w:r>
-          </w:p>
-        </w:tc>
-        <w:tc>
-          <w:tcPr>
-            <w:tcW w:type="dxa" w:w="3863"/>
-            <w:tcMar>
-              <w:top w:type="dxa" w:w="80"/>
-              <w:left w:type="dxa" w:w="110"/>
-              <w:bottom w:type="dxa" w:w="80"/>
-              <w:right w:type="dxa" w:w="110"/>
-            </w:tcMar>
-          </w:tcPr>
-          <w:p>
-            <w:pPr>
-              <w:spacing w:after="0" w:line="240"/>
-            </w:pPr>
-            <w:r>
-              <w:rPr>
-                <w:rFonts w:ascii="Times New Roman" w:cs="Times New Roman" w:eastAsia="Times New Roman" w:hAnsi="Times New Roman"/>
-                <w:sz w:val="19"/>
-                <w:szCs w:val="19"/>
-              </w:rPr>
-              <w:t xml:space="preserve">Sınırlı mekanik dayanım ve zayıf yangın dayanımı³; uzun süreli dayanıklılık bilgisinin sınırlılığı⁵</w:t>
+            <w:tcW w:type="dxa" w:w="3888"/>
+            <w:tcMar>
+              <w:top w:type="dxa" w:w="80"/>
+              <w:left w:type="dxa" w:w="110"/>
+              <w:bottom w:type="dxa" w:w="80"/>
+              <w:right w:type="dxa" w:w="110"/>
+            </w:tcMar>
+          </w:tcPr>
+          <w:p>
+            <w:pPr>
+              <w:spacing w:after="0" w:line="240"/>
+            </w:pPr>
+            <w:r>
+              <w:rPr>
+                <w:rFonts w:ascii="Times New Roman" w:cs="Times New Roman" w:eastAsia="Times New Roman" w:hAnsi="Times New Roman"/>
+                <w:sz w:val="19"/>
+                <w:szCs w:val="19"/>
+              </w:rPr>
+              <w:t xml:space="preserve">Isıl düzenleme kapasitesi (Bourbia ve diğ., 2023); mineral yalıtkanlarla karşılaştırılabilir ısıl performans (Edalat, 2026)</w:t>
+            </w:r>
+          </w:p>
+        </w:tc>
+        <w:tc>
+          <w:tcPr>
+            <w:tcW w:type="dxa" w:w="3888"/>
+            <w:tcMar>
+              <w:top w:type="dxa" w:w="80"/>
+              <w:left w:type="dxa" w:w="110"/>
+              <w:bottom w:type="dxa" w:w="80"/>
+              <w:right w:type="dxa" w:w="110"/>
+            </w:tcMar>
+          </w:tcPr>
+          <w:p>
+            <w:pPr>
+              <w:spacing w:after="0" w:line="240"/>
+            </w:pPr>
+            <w:r>
+              <w:rPr>
+                <w:rFonts w:ascii="Times New Roman" w:cs="Times New Roman" w:eastAsia="Times New Roman" w:hAnsi="Times New Roman"/>
+                <w:sz w:val="19"/>
+                <w:szCs w:val="19"/>
+              </w:rPr>
+              <w:t xml:space="preserve">Sınırlı mekanik dayanım ve zayıf yangın dayanımı (Edalat, 2026); uzun süreli dayanıklılık bilgisinin sınırlılığı (Chang ve diğ., 2020)</w:t>
             </w:r>
           </w:p>
         </w:tc>
@@ -3168,7 +3168,7 @@
       <w:tr>
         <w:tc>
           <w:tcPr>
-            <w:tcW w:type="dxa" w:w="1300"/>
+            <w:tcW w:type="dxa" w:w="1250"/>
             <w:tcMar>
               <w:top w:type="dxa" w:w="80"/>
               <w:left w:type="dxa" w:w="110"/>
@@ -3192,49 +3192,49 @@
         </w:tc>
         <w:tc>
           <w:tcPr>
-            <w:tcW w:type="dxa" w:w="3863"/>
-            <w:tcMar>
-              <w:top w:type="dxa" w:w="80"/>
-              <w:left w:type="dxa" w:w="110"/>
-              <w:bottom w:type="dxa" w:w="80"/>
-              <w:right w:type="dxa" w:w="110"/>
-            </w:tcMar>
-          </w:tcPr>
-          <w:p>
-            <w:pPr>
-              <w:spacing w:after="0" w:line="240"/>
-            </w:pPr>
-            <w:r>
-              <w:rPr>
-                <w:rFonts w:ascii="Times New Roman" w:cs="Times New Roman" w:eastAsia="Times New Roman" w:hAnsi="Times New Roman"/>
-                <w:sz w:val="19"/>
-                <w:szCs w:val="19"/>
-              </w:rPr>
-              <w:t xml:space="preserve">Bambuda yapısal standartların oluşması (ISO 22156, ISO 19624)³</w:t>
-            </w:r>
-          </w:p>
-        </w:tc>
-        <w:tc>
-          <w:tcPr>
-            <w:tcW w:type="dxa" w:w="3863"/>
-            <w:tcMar>
-              <w:top w:type="dxa" w:w="80"/>
-              <w:left w:type="dxa" w:w="110"/>
-              <w:bottom w:type="dxa" w:w="80"/>
-              <w:right w:type="dxa" w:w="110"/>
-            </w:tcMar>
-          </w:tcPr>
-          <w:p>
-            <w:pPr>
-              <w:spacing w:after="0" w:line="240"/>
-            </w:pPr>
-            <w:r>
-              <w:rPr>
-                <w:rFonts w:ascii="Times New Roman" w:cs="Times New Roman" w:eastAsia="Times New Roman" w:hAnsi="Times New Roman"/>
-                <w:sz w:val="19"/>
-                <w:szCs w:val="19"/>
-              </w:rPr>
-              <w:t xml:space="preserve">Çoğu ahşap dışı malzemede kod, kamusal farkındalık ve uzman yüklenici ağı eksikliği³; yönetsel boyutun araştırmada zayıf kalması⁶</w:t>
+            <w:tcW w:type="dxa" w:w="3888"/>
+            <w:tcMar>
+              <w:top w:type="dxa" w:w="80"/>
+              <w:left w:type="dxa" w:w="110"/>
+              <w:bottom w:type="dxa" w:w="80"/>
+              <w:right w:type="dxa" w:w="110"/>
+            </w:tcMar>
+          </w:tcPr>
+          <w:p>
+            <w:pPr>
+              <w:spacing w:after="0" w:line="240"/>
+            </w:pPr>
+            <w:r>
+              <w:rPr>
+                <w:rFonts w:ascii="Times New Roman" w:cs="Times New Roman" w:eastAsia="Times New Roman" w:hAnsi="Times New Roman"/>
+                <w:sz w:val="19"/>
+                <w:szCs w:val="19"/>
+              </w:rPr>
+              <w:t xml:space="preserve">Bambuda yapısal standartların oluşması: ISO 22156 ve ISO 19624 (Edalat, 2026)</w:t>
+            </w:r>
+          </w:p>
+        </w:tc>
+        <w:tc>
+          <w:tcPr>
+            <w:tcW w:type="dxa" w:w="3888"/>
+            <w:tcMar>
+              <w:top w:type="dxa" w:w="80"/>
+              <w:left w:type="dxa" w:w="110"/>
+              <w:bottom w:type="dxa" w:w="80"/>
+              <w:right w:type="dxa" w:w="110"/>
+            </w:tcMar>
+          </w:tcPr>
+          <w:p>
+            <w:pPr>
+              <w:spacing w:after="0" w:line="240"/>
+            </w:pPr>
+            <w:r>
+              <w:rPr>
+                <w:rFonts w:ascii="Times New Roman" w:cs="Times New Roman" w:eastAsia="Times New Roman" w:hAnsi="Times New Roman"/>
+                <w:sz w:val="19"/>
+                <w:szCs w:val="19"/>
+              </w:rPr>
+              <w:t xml:space="preserve">Çoğu ahşap dışı malzemede kod, kamusal farkındalık ve uzman yüklenici ağı eksikliği (Edalat, 2026); yönetsel boyutun araştırmada zayıf kalması (Pomponi ve Moncaster, 2017)</w:t>
             </w:r>
           </w:p>
         </w:tc>
@@ -3242,7 +3242,7 @@
       <w:tr>
         <w:tc>
           <w:tcPr>
-            <w:tcW w:type="dxa" w:w="1300"/>
+            <w:tcW w:type="dxa" w:w="1250"/>
             <w:tcMar>
               <w:top w:type="dxa" w:w="80"/>
               <w:left w:type="dxa" w:w="110"/>
@@ -3266,49 +3266,49 @@
         </w:tc>
         <w:tc>
           <w:tcPr>
-            <w:tcW w:type="dxa" w:w="3863"/>
-            <w:tcMar>
-              <w:top w:type="dxa" w:w="80"/>
-              <w:left w:type="dxa" w:w="110"/>
-              <w:bottom w:type="dxa" w:w="80"/>
-              <w:right w:type="dxa" w:w="110"/>
-            </w:tcMar>
-          </w:tcPr>
-          <w:p>
-            <w:pPr>
-              <w:spacing w:after="0" w:line="240"/>
-            </w:pPr>
-            <w:r>
-              <w:rPr>
-                <w:rFonts w:ascii="Times New Roman" w:cs="Times New Roman" w:eastAsia="Times New Roman" w:hAnsi="Times New Roman"/>
-                <w:sz w:val="19"/>
-                <w:szCs w:val="19"/>
-              </w:rPr>
-              <w:t xml:space="preserve">Miselyumun kendi kendine bağlanma yoluyla bağlayıcı gereksinimini ortadan kaldırması²</w:t>
-            </w:r>
-          </w:p>
-        </w:tc>
-        <w:tc>
-          <w:tcPr>
-            <w:tcW w:type="dxa" w:w="3863"/>
-            <w:tcMar>
-              <w:top w:type="dxa" w:w="80"/>
-              <w:left w:type="dxa" w:w="110"/>
-              <w:bottom w:type="dxa" w:w="80"/>
-              <w:right w:type="dxa" w:w="110"/>
-            </w:tcMar>
-          </w:tcPr>
-          <w:p>
-            <w:pPr>
-              <w:spacing w:after="0" w:line="240"/>
-            </w:pPr>
-            <w:r>
-              <w:rPr>
-                <w:rFonts w:ascii="Times New Roman" w:cs="Times New Roman" w:eastAsia="Times New Roman" w:hAnsi="Times New Roman"/>
-                <w:sz w:val="19"/>
-                <w:szCs w:val="19"/>
-              </w:rPr>
-              <w:t xml:space="preserve">Sökülebilirlik için tasarım ilkelerinin uygulamaya çok az geçmiş olması⁷; ömür sonu planlaması ve toplama altyapısındaki boşluklar³</w:t>
+            <w:tcW w:type="dxa" w:w="3888"/>
+            <w:tcMar>
+              <w:top w:type="dxa" w:w="80"/>
+              <w:left w:type="dxa" w:w="110"/>
+              <w:bottom w:type="dxa" w:w="80"/>
+              <w:right w:type="dxa" w:w="110"/>
+            </w:tcMar>
+          </w:tcPr>
+          <w:p>
+            <w:pPr>
+              <w:spacing w:after="0" w:line="240"/>
+            </w:pPr>
+            <w:r>
+              <w:rPr>
+                <w:rFonts w:ascii="Times New Roman" w:cs="Times New Roman" w:eastAsia="Times New Roman" w:hAnsi="Times New Roman"/>
+                <w:sz w:val="19"/>
+                <w:szCs w:val="19"/>
+              </w:rPr>
+              <w:t xml:space="preserve">Miselyumun kendi kendine bağlanma yoluyla bağlayıcı gereksinimini ortadan kaldırması (Attias ve diğ., 2020)</w:t>
+            </w:r>
+          </w:p>
+        </w:tc>
+        <w:tc>
+          <w:tcPr>
+            <w:tcW w:type="dxa" w:w="3888"/>
+            <w:tcMar>
+              <w:top w:type="dxa" w:w="80"/>
+              <w:left w:type="dxa" w:w="110"/>
+              <w:bottom w:type="dxa" w:w="80"/>
+              <w:right w:type="dxa" w:w="110"/>
+            </w:tcMar>
+          </w:tcPr>
+          <w:p>
+            <w:pPr>
+              <w:spacing w:after="0" w:line="240"/>
+            </w:pPr>
+            <w:r>
+              <w:rPr>
+                <w:rFonts w:ascii="Times New Roman" w:cs="Times New Roman" w:eastAsia="Times New Roman" w:hAnsi="Times New Roman"/>
+                <w:sz w:val="19"/>
+                <w:szCs w:val="19"/>
+              </w:rPr>
+              <w:t xml:space="preserve">Sökülebilirlik için tasarım ilkelerinin uygulamaya çok az geçmiş olması (Rios ve diğ., 2015); ömür sonu planlaması ve toplama altyapısındaki boşluklar (Edalat, 2026)</w:t>
             </w:r>
           </w:p>
         </w:tc>
@@ -3316,7 +3316,7 @@
       <w:tr>
         <w:tc>
           <w:tcPr>
-            <w:tcW w:type="dxa" w:w="1300"/>
+            <w:tcW w:type="dxa" w:w="1250"/>
             <w:tcMar>
               <w:top w:type="dxa" w:w="80"/>
               <w:left w:type="dxa" w:w="110"/>
@@ -3340,49 +3340,49 @@
         </w:tc>
         <w:tc>
           <w:tcPr>
-            <w:tcW w:type="dxa" w:w="3863"/>
-            <w:tcMar>
-              <w:top w:type="dxa" w:w="80"/>
-              <w:left w:type="dxa" w:w="110"/>
-              <w:bottom w:type="dxa" w:w="80"/>
-              <w:right w:type="dxa" w:w="110"/>
-            </w:tcMar>
-          </w:tcPr>
-          <w:p>
-            <w:pPr>
-              <w:spacing w:after="0" w:line="240"/>
-            </w:pPr>
-            <w:r>
-              <w:rPr>
-                <w:rFonts w:ascii="Times New Roman" w:cs="Times New Roman" w:eastAsia="Times New Roman" w:hAnsi="Times New Roman"/>
-                <w:sz w:val="19"/>
-                <w:szCs w:val="19"/>
-              </w:rPr>
-              <w:t xml:space="preserve">Biyolojik tasarım sisteminin doğası gereği döngüsel olması⁸</w:t>
-            </w:r>
-          </w:p>
-        </w:tc>
-        <w:tc>
-          <w:tcPr>
-            <w:tcW w:type="dxa" w:w="3863"/>
-            <w:tcMar>
-              <w:top w:type="dxa" w:w="80"/>
-              <w:left w:type="dxa" w:w="110"/>
-              <w:bottom w:type="dxa" w:w="80"/>
-              <w:right w:type="dxa" w:w="110"/>
-            </w:tcMar>
-          </w:tcPr>
-          <w:p>
-            <w:pPr>
-              <w:spacing w:after="0" w:line="240"/>
-            </w:pPr>
-            <w:r>
-              <w:rPr>
-                <w:rFonts w:ascii="Times New Roman" w:cs="Times New Roman" w:eastAsia="Times New Roman" w:hAnsi="Times New Roman"/>
-                <w:sz w:val="19"/>
-                <w:szCs w:val="19"/>
-              </w:rPr>
-              <w:t xml:space="preserve">Döngüsellik tanımlarının çoğunun sistemsel değişimi vurgulamaması⁹</w:t>
+            <w:tcW w:type="dxa" w:w="3888"/>
+            <w:tcMar>
+              <w:top w:type="dxa" w:w="80"/>
+              <w:left w:type="dxa" w:w="110"/>
+              <w:bottom w:type="dxa" w:w="80"/>
+              <w:right w:type="dxa" w:w="110"/>
+            </w:tcMar>
+          </w:tcPr>
+          <w:p>
+            <w:pPr>
+              <w:spacing w:after="0" w:line="240"/>
+            </w:pPr>
+            <w:r>
+              <w:rPr>
+                <w:rFonts w:ascii="Times New Roman" w:cs="Times New Roman" w:eastAsia="Times New Roman" w:hAnsi="Times New Roman"/>
+                <w:sz w:val="19"/>
+                <w:szCs w:val="19"/>
+              </w:rPr>
+              <w:t xml:space="preserve">Biyolojik tasarım sisteminin doğası gereği döngüsel olması (Andréen ve Goidea, 2022)</w:t>
+            </w:r>
+          </w:p>
+        </w:tc>
+        <w:tc>
+          <w:tcPr>
+            <w:tcW w:type="dxa" w:w="3888"/>
+            <w:tcMar>
+              <w:top w:type="dxa" w:w="80"/>
+              <w:left w:type="dxa" w:w="110"/>
+              <w:bottom w:type="dxa" w:w="80"/>
+              <w:right w:type="dxa" w:w="110"/>
+            </w:tcMar>
+          </w:tcPr>
+          <w:p>
+            <w:pPr>
+              <w:spacing w:after="0" w:line="240"/>
+            </w:pPr>
+            <w:r>
+              <w:rPr>
+                <w:rFonts w:ascii="Times New Roman" w:cs="Times New Roman" w:eastAsia="Times New Roman" w:hAnsi="Times New Roman"/>
+                <w:sz w:val="19"/>
+                <w:szCs w:val="19"/>
+              </w:rPr>
+              <w:t xml:space="preserve">Döngüsellik tanımlarının çoğunun sistemsel değişimi vurgulamaması (Kirchherr ve diğ., 2017)</w:t>
             </w:r>
           </w:p>
         </w:tc>
@@ -3390,7 +3390,7 @@
       <w:tr>
         <w:tc>
           <w:tcPr>
-            <w:tcW w:type="dxa" w:w="1300"/>
+            <w:tcW w:type="dxa" w:w="1250"/>
             <w:tcMar>
               <w:top w:type="dxa" w:w="80"/>
               <w:left w:type="dxa" w:w="110"/>
@@ -3414,69 +3414,54 @@
         </w:tc>
         <w:tc>
           <w:tcPr>
-            <w:tcW w:type="dxa" w:w="3863"/>
-            <w:tcMar>
-              <w:top w:type="dxa" w:w="80"/>
-              <w:left w:type="dxa" w:w="110"/>
-              <w:bottom w:type="dxa" w:w="80"/>
-              <w:right w:type="dxa" w:w="110"/>
-            </w:tcMar>
-          </w:tcPr>
-          <w:p>
-            <w:pPr>
-              <w:spacing w:after="0" w:line="240"/>
-            </w:pPr>
-            <w:r>
-              <w:rPr>
-                <w:rFonts w:ascii="Times New Roman" w:cs="Times New Roman" w:eastAsia="Times New Roman" w:hAnsi="Times New Roman"/>
-                <w:sz w:val="19"/>
-                <w:szCs w:val="19"/>
-              </w:rPr>
-              <w:t xml:space="preserve">Teknik ve deneyimsel niteliklerin tasarıma girdi oluşturması¹⁰; öz üretimin tasarımcıya açtığı deney alanı¹¹</w:t>
-            </w:r>
-          </w:p>
-        </w:tc>
-        <w:tc>
-          <w:tcPr>
-            <w:tcW w:type="dxa" w:w="3863"/>
-            <w:tcMar>
-              <w:top w:type="dxa" w:w="80"/>
-              <w:left w:type="dxa" w:w="110"/>
-              <w:bottom w:type="dxa" w:w="80"/>
-              <w:right w:type="dxa" w:w="110"/>
-            </w:tcMar>
-          </w:tcPr>
-          <w:p>
-            <w:pPr>
-              <w:spacing w:after="0" w:line="240"/>
-            </w:pPr>
-            <w:r>
-              <w:rPr>
-                <w:rFonts w:ascii="Times New Roman" w:cs="Times New Roman" w:eastAsia="Times New Roman" w:hAnsi="Times New Roman"/>
-                <w:sz w:val="19"/>
-                <w:szCs w:val="19"/>
-              </w:rPr>
-              <w:t xml:space="preserve">Malzemenin toplum tarafından kabulüne ilişkin belirsizlik¹²; endüstriyel üretimle koşullanmış tekdüzelik beklentisi¹³</w:t>
+            <w:tcW w:type="dxa" w:w="3888"/>
+            <w:tcMar>
+              <w:top w:type="dxa" w:w="80"/>
+              <w:left w:type="dxa" w:w="110"/>
+              <w:bottom w:type="dxa" w:w="80"/>
+              <w:right w:type="dxa" w:w="110"/>
+            </w:tcMar>
+          </w:tcPr>
+          <w:p>
+            <w:pPr>
+              <w:spacing w:after="0" w:line="240"/>
+            </w:pPr>
+            <w:r>
+              <w:rPr>
+                <w:rFonts w:ascii="Times New Roman" w:cs="Times New Roman" w:eastAsia="Times New Roman" w:hAnsi="Times New Roman"/>
+                <w:sz w:val="19"/>
+                <w:szCs w:val="19"/>
+              </w:rPr>
+              <w:t xml:space="preserve">Teknik ve deneyimsel niteliklerin tasarıma girdi oluşturması (Karana ve diğ., 2015); öz üretimin tasarımcıya açtığı deney alanı (Rognoli ve diğ., 2015)</w:t>
+            </w:r>
+          </w:p>
+        </w:tc>
+        <w:tc>
+          <w:tcPr>
+            <w:tcW w:type="dxa" w:w="3888"/>
+            <w:tcMar>
+              <w:top w:type="dxa" w:w="80"/>
+              <w:left w:type="dxa" w:w="110"/>
+              <w:bottom w:type="dxa" w:w="80"/>
+              <w:right w:type="dxa" w:w="110"/>
+            </w:tcMar>
+          </w:tcPr>
+          <w:p>
+            <w:pPr>
+              <w:spacing w:after="0" w:line="240"/>
+            </w:pPr>
+            <w:r>
+              <w:rPr>
+                <w:rFonts w:ascii="Times New Roman" w:cs="Times New Roman" w:eastAsia="Times New Roman" w:hAnsi="Times New Roman"/>
+                <w:sz w:val="19"/>
+                <w:szCs w:val="19"/>
+              </w:rPr>
+              <w:t xml:space="preserve">Malzemenin toplum tarafından kabulüne ilişkin belirsizlik (Karana ve diğ., 2018); endüstriyel üretimle koşullanmış tekdüzelik beklentisi (Rognoli ve Ayala García, 2018)</w:t>
             </w:r>
           </w:p>
         </w:tc>
       </w:tr>
     </w:tbl>
-    <w:p>
-      <w:pPr>
-        <w:spacing w:after="340" w:before="130" w:line="240"/>
-      </w:pPr>
-      <w:r>
-        <w:rPr>
-          <w:rFonts w:ascii="Times New Roman" w:cs="Times New Roman" w:eastAsia="Times New Roman" w:hAnsi="Times New Roman"/>
-          <w:i/>
-          <w:iCs/>
-          <w:sz w:val="18"/>
-          <w:szCs w:val="18"/>
-        </w:rPr>
-        <w:t xml:space="preserve">¹ Lee ve diğ. (2022) · ² Attias ve diğ. (2020) · ³ Edalat (2026) · ⁴ Bourbia ve diğ. (2023) · ⁵ Chang ve diğ. (2020) · ⁶ Pomponi ve Moncaster (2017) · ⁷ Rios ve diğ. (2015) · ⁸ Andréen ve Goidea (2022) · ⁹ Kirchherr ve diğ. (2017) · ¹⁰ Karana ve diğ. (2015) · ¹¹ Rognoli ve diğ. (2015) · ¹² Karana ve diğ. (2018) · ¹³ Rognoli ve Ayala García (2018)</w:t>
-      </w:r>
-    </w:p>
     <w:p>
       <w:pPr>
         <w:spacing w:after="160" w:line="360"/>

</xml_diff>

<commit_message>
Özü akademik kipe çevir ve sav odaklı yeniden yaz
Önceki öz bölümün içindekiler listesi gibi okunuyordu. Kuramsal bir
bölümün özü ne yaptığını değil ne iddia ettiğini söylemelidir.

- Anlatı sırası yerine bölümün temel savı özün merkezine taşındı
- Geniş zaman ile edilgen çatı karışıklığı giderildi, metin akademik
  Türkçenin yerleşik -mAktA kipine çevrildi
- Bölümün özgün katkısı olan üç düzlemin birbirini kapsaması ilk kez
  özde açıkça yer aldı
- Konuşma diline yakın geçişler kaldırıldı
- 135 kelimeden 157 kelimeye çıktı

Uzayan özü karşılamak için birinci başlıktaki tablo dökümü tek cümleye
indirildi ve altıncı başlıktaki tez örneğinin yöntem ayrıntısı seyreltildi.

20 sayfa (ölçüldü), 33 kaynak, hepsi metinde kullanılıyor.

Co-Authored-By: Claude Opus 5 <noreply@anthropic.com>
Claude-Session: https://claude.ai/code/session_01A7bv5SYpnVudfqWACh8kXV
</commit_message>
<xml_diff>
--- a/Kitap_Bolumu_Biyotasarim_Malzeme_Secimi.docx
+++ b/Kitap_Bolumu_Biyotasarim_Malzeme_Secimi.docx
@@ -51,16 +51,16 @@
     </w:p>
     <w:p>
       <w:pPr>
-        <w:spacing w:after="200" w:line="360"/>
-        <w:jc w:val="both"/>
-      </w:pPr>
-      <w:r>
-        <w:rPr>
-          <w:rFonts w:ascii="Times New Roman" w:cs="Times New Roman" w:eastAsia="Times New Roman" w:hAnsi="Times New Roman"/>
-          <w:sz w:val="24"/>
-          <w:szCs w:val="24"/>
-        </w:rPr>
-        <w:t xml:space="preserve">Yapılı çevrenin kaynak tüketimi ve atık üretimi, malzeme kararlarının yeniden düşünülmesini zorunlu kılmaktadır. Biyolojik temelli malzemeler bu tartışmada çoğu kez geleneksel malzemelerin sürdürülebilir birer alternatifi olarak sunulur. Oysa böyle bir kurgu malzeme kararının yapısını değiştirmediği için sınırlı bir dönüşüm üretir. Bu bölüm, iç mimarlıkta biyolojik temelli malzeme seçimini kuramsal bir çerçevede ele alır. Temel savı, biyotasarımın yalnızca yeni seçenekler sunmadığı, malzeme seçiminin ölçütlerini ve tasarımcının kaynakla, üretimle, kullanımla ve atıkla kurduğu ilişkiyi yeniden tanımladığıdır. Çalışma önce biyotasarımı komşu kavramlardan ayırır, ardından biyolojik temelli malzemeleri doğanın tasarım sürecine katılım düzeyine göre sınıflandırır. Biyolojik kökenin tek başına ne sürdürülebilirlik ne döngüsellik güvencesi oluşturduğu gösterilir. Döngüsellik, malzemenin kökeninden çok tasarım aşamasında alınan bileşim, birleşim ve ömür sonu kararlarıyla şekillenir. Son olarak sürdürülebilirlik, döngüsellik ve dirençlilik ölçütlerini birlikte okuyan, iç mekân ölçeğine özgü altı boyutlu bir değerlendirme çerçevesi önerilir.</w:t>
+        <w:spacing w:after="160" w:line="360"/>
+        <w:jc w:val="both"/>
+      </w:pPr>
+      <w:r>
+        <w:rPr>
+          <w:rFonts w:ascii="Times New Roman" w:cs="Times New Roman" w:eastAsia="Times New Roman" w:hAnsi="Times New Roman"/>
+          <w:sz w:val="24"/>
+          <w:szCs w:val="24"/>
+        </w:rPr>
+        <w:t xml:space="preserve">Yapılı çevrenin kaynak tüketimi ve atık üretimi, malzeme kararlarının yeniden düşünülmesini zorunlu kılmaktadır. Biyolojik temelli malzemeler bu tartışmada çoğunlukla geleneksel malzemelerin sürdürülebilir alternatifleri olarak konumlandırılmakta, ancak böyle bir yaklaşım malzeme kararının kuruluşunu değiştirmediği için dönüştürücü etkisi sınırlı kalmaktadır. Bu bölüm, iç mimarlıkta biyolojik temelli malzeme seçimini kuramsal bir çerçevede ele almakta ve seçimin hangi ölçütler üzerinden kurulduğunu sorgulamaktadır. Bölümün temel savına göre biyotasarım, tasarımcının önüne yalnızca yeni malzeme seçenekleri koymamakta, malzeme seçiminin ölçütlerini ve tasarımcının kaynak, üretim, kullanım ve atıkla kurduğu ilişkiyi yeniden tanımlamaktadır. İnceleme, biyotasarımın komşu kavramlardan ayrıştırılması ve biyolojik temelli malzemelerin doğanın tasarım sürecine katılım düzeyine göre sınıflandırılması üzerinden ilerlemekte, biyolojik kökenin tek başına ne sürdürülebilirlik ne de döngüsellik güvencesi oluşturduğunu ortaya koymaktadır. Döngüselliğin ve dirençliliğin, malzemenin kökeninden çok tasarım aşamasında alınan bileşim, birleşim ve ömür sonu kararlarıyla şekillendiği savunulmaktadır. Bölüm, sürdürülebilirlik, döngüsellik ve dirençliliği birbirini kapsayan üç değerlendirme düzlemi olarak ele almakta ve iç mekân ölçeğine özgü altı boyutlu bir değerlendirme çerçevesi önerisiyle sonuçlanmaktadır.</w:t>
       </w:r>
     </w:p>
     <w:p>
@@ -187,7 +187,7 @@
           <w:sz w:val="24"/>
           <w:szCs w:val="24"/>
         </w:rPr>
-        <w:t xml:space="preserve">Tartışma, kavramsal ayrımlardan başlayıp malzeme, döngüsellik ve dirençlilik tartışmalarından geçerek iç mekân ölçeğine ve oradan da bir değerlendirme önerisine doğru ilerlemektedir. Yol boyunca dört tablo ile bir şekil kullanılmış, kavramlar arasındaki ayrımlar (Tablo 1), malzeme yaklaşımlarının karşılaştırması (Tablo 2), potansiyel ile sınırlılıkların dökümü (Tablo 3) ve önerilen çerçeve (Tablo 4, Şekil 1) bu görsellerde toplanmıştır. Çalışma seçilmiş kaynaklara dayanan kuramsal bir derleme niteliğindedir ve sistematik bir yazın taraması amaçlamamaktadır.</w:t>
+        <w:t xml:space="preserve">Tartışma, kavramsal ayrımlardan başlayıp malzeme, döngüsellik ve dirençlilik tartışmalarından geçerek iç mekân ölçeğine ve oradan da bir değerlendirme önerisine doğru ilerlemektedir. Tartışmanın düğüm noktaları dört tablo ile bir şekilde toplanmıştır. Çalışma seçilmiş kaynaklara dayanan kuramsal bir derleme niteliğindedir ve sistematik bir yazın taraması amaçlamamaktadır.</w:t>
       </w:r>
     </w:p>
     <w:p>
@@ -2711,7 +2711,7 @@
           <w:sz w:val="24"/>
           <w:szCs w:val="24"/>
         </w:rPr>
-        <w:t xml:space="preserve">Başlıkta tartışılan üç ilişki, atık yumurta kabuğu ile doğal polimer esaslı bir bağlayıcı sistemden geliştirilen bir biyokompozit üzerinden tek bir örnekte birleşmiştir (Ünal, 2025). Söz konusu çalışmada malzeme bir ürün önerisi olarak değil tasarım aracı olarak ele alınmıştır. Teknik ve deneyimsel nitelikleri Malzeme Odaklı Tasarım yöntemiyle birlikte değerlendirilmiş, malzeme değişkenliği ise sökülüp yeniden kurulabilir modüler bir iç mekân sistemine aktarılmıştır.</w:t>
+        <w:t xml:space="preserve">Başlıkta tartışılan üç ilişki, atık yumurta kabuğu ile doğal polimer esaslı bir bağlayıcı sistemden geliştirilen bir biyokompozit üzerinden tek bir örnekte birleşmiştir (Ünal, 2025). Söz konusu çalışmada malzeme bir ürün önerisi olarak değil tasarım aracı olarak ele alınmış, değişkenliği ise sökülüp yeniden kurulabilir modüler bir iç mekân sistemine aktarılmıştır.</w:t>
       </w:r>
     </w:p>
     <w:p>

</xml_diff>